<commit_message>
Make GUI DPI-aware; give the preview all spare height; move file actions
- Declare system DPI awareness so Windows no longer bitmap-stretches the
  window; scale all pixel sizes, scrollbars and the logo (pre-scaled
  variants per scale) with the display scale
- Draw scalable tick-box images for the filter groups
- Use the full work-area height and let the anonymized-text preview take
  the remaining space; compact rows and put the title/instruction next to
  the "Verplicht" heading
- Remove the result summary and path links under the preview; open the
  result, output folder and log from the log popup or from small links on
  the status line
- Log lists active and disabled filter groups one per line; popup is
  centred and sized to show the whole log
- Reset the cancel button label after a run
- Update the EXE guide and regenerate the Word manual

Co-Authored-By: Claude Opus 5.5 <noreply@anthropic.com>
</commit_message>
<xml_diff>
--- a/Gebruiksaanwijzing_HealthNoord.docx
+++ b/Gebruiksaanwijzing_HealthNoord.docx
@@ -1447,7 +1447,7 @@
     </w:p>
     <w:p>
       <w:r>
-        <w:t>Na succes verschijnt automatisch een scrollbaar venster met de volledige logresultaten. Sluit het met Sluiten, Escape of het kruisje. Gebruik Open resultaat om het bestand te openen en Open uitvoermap om de uitvoermap te bekijken. De weergegeven uitvoer- en logpaden zijn ook aanklikbaar.</w:t>
+        <w:t>Na succes verschijnt automatisch een scrollbaar venster met de volledige logresultaten, waaronder per filtergroep of die aan of uit stond. Onderin open je met Open resultaat het bestand, met Open uitvoermap de map en met Open log het logbestand. Sluit het met Sluiten, Escape of het kruisje. Daarna blijven dezelfde acties beschikbaar als kleine links (Resultaat · Uitvoermap · Log) rechts op de statusregel, tot je een nieuwe run start.</w:t>
       </w:r>
     </w:p>
     <w:tbl>
@@ -1680,7 +1680,7 @@
               <w:rPr>
                 <w:sz w:val="18"/>
               </w:rPr>
-              <w:t>Actieve filtergroepen en alleen de ja/nee-status voor whitelist en extra lijsten.</w:t>
+              <w:t>Actieve en uitgeschakelde filtergroepen en alleen de ja/nee-status voor whitelist en extra lijsten.</w:t>
             </w:r>
           </w:p>
         </w:tc>

</xml_diff>

<commit_message>
Add screenshots to the Word user manual
- Five screenshots of the current GUI (synthetic data only) in
  docs/handleiding/: main window, file choice with pre-run check, filter
  groups and lists, progress, and the results/log popup
- create_user_manual.py inserts each screenshot for its figure and falls
  back to the placeholder when the image is missing
- Regenerate Gebruiksaanwijzing_HealthNoord.docx

Co-Authored-By: Claude Opus 5.5 <noreply@anthropic.com>
</commit_message>
<xml_diff>
--- a/Gebruiksaanwijzing_HealthNoord.docx
+++ b/Gebruiksaanwijzing_HealthNoord.docx
@@ -691,60 +691,45 @@
         <w:t>De hoofdschermindeling bestaat uit een bestandsgedeelte, filterinstellingen, runbediening en een resultaatvoorbeeld. Bestandsdialogen openen telkens in de map waar de applicatie staat.</w:t>
       </w:r>
     </w:p>
-    <w:tbl>
-      <w:tblPr>
-        <w:tblW w:type="auto" w:w="0"/>
-        <w:tblLayout w:type="fixed"/>
-        <w:tblLook w:firstColumn="1" w:firstRow="1" w:lastColumn="0" w:lastRow="0" w:noHBand="0" w:noVBand="1" w:val="04A0"/>
-      </w:tblPr>
-      <w:tblGrid>
-        <w:gridCol w:w="9864"/>
-      </w:tblGrid>
-      <w:tr>
-        <w:tc>
-          <w:tcPr>
-            <w:tcW w:type="dxa" w:w="9864"/>
-            <w:vAlign w:val="center"/>
-            <w:shd w:fill="F7F8FA"/>
-            <w:tcBorders>
-              <w:top w:val="single" w:sz="12" w:color="EA590C"/>
-              <w:left w:val="single" w:sz="12" w:color="EA590C"/>
-              <w:bottom w:val="single" w:sz="12" w:color="EA590C"/>
-              <w:right w:val="single" w:sz="12" w:color="EA590C"/>
-              <w:insideH w:val="single" w:sz="12" w:color="EA590C"/>
-              <w:insideV w:val="single" w:sz="12" w:color="EA590C"/>
-            </w:tcBorders>
-          </w:tcPr>
-          <w:p>
-            <w:pPr>
-              <w:spacing w:before="580" w:after="100"/>
-              <w:jc w:val="center"/>
-            </w:pPr>
-            <w:r>
-              <w:rPr>
-                <w:b/>
-                <w:color w:val="EA590C"/>
-                <w:sz w:val="26"/>
-              </w:rPr>
-              <w:t>[SCREENSHOT HOOFDSCHERM HIER INVOEGEN]</w:t>
-            </w:r>
-          </w:p>
-          <w:p>
-            <w:pPr>
-              <w:spacing w:after="580"/>
-              <w:jc w:val="center"/>
-            </w:pPr>
-            <w:r>
-              <w:rPr>
-                <w:color w:val="637083"/>
-                <w:sz w:val="18"/>
-              </w:rPr>
-              <w:t>Voeg hier een afbeelding in van het volledige hoofdvenster. Houd bestandsnamen en voorbeeldtekst niet-persoonlijk.</w:t>
-            </w:r>
-          </w:p>
-        </w:tc>
-      </w:tr>
-    </w:tbl>
+    <w:p>
+      <w:pPr>
+        <w:jc w:val="center"/>
+      </w:pPr>
+      <w:r>
+        <w:drawing>
+          <wp:inline xmlns:a="http://schemas.openxmlformats.org/drawingml/2006/main" xmlns:pic="http://schemas.openxmlformats.org/drawingml/2006/picture">
+            <wp:extent cx="5943600" cy="4442841"/>
+            <wp:docPr id="2" name="Picture 2"/>
+            <wp:cNvGraphicFramePr>
+              <a:graphicFrameLocks noChangeAspect="1"/>
+            </wp:cNvGraphicFramePr>
+            <a:graphic>
+              <a:graphicData uri="http://schemas.openxmlformats.org/drawingml/2006/picture">
+                <pic:pic>
+                  <pic:nvPicPr>
+                    <pic:cNvPr id="0" name="hoofdscherm.png"/>
+                    <pic:cNvPicPr/>
+                  </pic:nvPicPr>
+                  <pic:blipFill>
+                    <a:blip r:embed="rId12"/>
+                    <a:stretch>
+                      <a:fillRect/>
+                    </a:stretch>
+                  </pic:blipFill>
+                  <pic:spPr>
+                    <a:xfrm>
+                      <a:off x="0" y="0"/>
+                      <a:ext cx="5943600" cy="4442841"/>
+                    </a:xfrm>
+                    <a:prstGeom prst="rect"/>
+                  </pic:spPr>
+                </pic:pic>
+              </a:graphicData>
+            </a:graphic>
+          </wp:inline>
+        </w:drawing>
+      </w:r>
+    </w:p>
     <w:p>
       <w:pPr>
         <w:pStyle w:val="Caption"/>
@@ -1063,60 +1048,45 @@
         <w:t>Bevestig de start. Tijdens de verwerking worden bestandskeuzes en filters vergrendeld om wijzigingen midden in een run te voorkomen.</w:t>
       </w:r>
     </w:p>
-    <w:tbl>
-      <w:tblPr>
-        <w:tblW w:type="auto" w:w="0"/>
-        <w:tblLayout w:type="fixed"/>
-        <w:tblLook w:firstColumn="1" w:firstRow="1" w:lastColumn="0" w:lastRow="0" w:noHBand="0" w:noVBand="1" w:val="04A0"/>
-      </w:tblPr>
-      <w:tblGrid>
-        <w:gridCol w:w="9864"/>
-      </w:tblGrid>
-      <w:tr>
-        <w:tc>
-          <w:tcPr>
-            <w:tcW w:type="dxa" w:w="9864"/>
-            <w:vAlign w:val="center"/>
-            <w:shd w:fill="F7F8FA"/>
-            <w:tcBorders>
-              <w:top w:val="single" w:sz="12" w:color="EA590C"/>
-              <w:left w:val="single" w:sz="12" w:color="EA590C"/>
-              <w:bottom w:val="single" w:sz="12" w:color="EA590C"/>
-              <w:right w:val="single" w:sz="12" w:color="EA590C"/>
-              <w:insideH w:val="single" w:sz="12" w:color="EA590C"/>
-              <w:insideV w:val="single" w:sz="12" w:color="EA590C"/>
-            </w:tcBorders>
-          </w:tcPr>
-          <w:p>
-            <w:pPr>
-              <w:spacing w:before="580" w:after="100"/>
-              <w:jc w:val="center"/>
-            </w:pPr>
-            <w:r>
-              <w:rPr>
-                <w:b/>
-                <w:color w:val="EA590C"/>
-                <w:sz w:val="26"/>
-              </w:rPr>
-              <w:t>[SCREENSHOT BESTANDSKEUZE EN VOORCONTROLE HIER INVOEGEN]</w:t>
-            </w:r>
-          </w:p>
-          <w:p>
-            <w:pPr>
-              <w:spacing w:after="580"/>
-              <w:jc w:val="center"/>
-            </w:pPr>
-            <w:r>
-              <w:rPr>
-                <w:color w:val="637083"/>
-                <w:sz w:val="18"/>
-              </w:rPr>
-              <w:t>Voeg hier een screenshot toe met voorbeeldbestanden en de bevestiging voor de start. Gebruik uitsluitend synthetische namen.</w:t>
-            </w:r>
-          </w:p>
-        </w:tc>
-      </w:tr>
-    </w:tbl>
+    <w:p>
+      <w:pPr>
+        <w:jc w:val="center"/>
+      </w:pPr>
+      <w:r>
+        <w:drawing>
+          <wp:inline xmlns:a="http://schemas.openxmlformats.org/drawingml/2006/main" xmlns:pic="http://schemas.openxmlformats.org/drawingml/2006/picture">
+            <wp:extent cx="5943600" cy="4442841"/>
+            <wp:docPr id="3" name="Picture 3"/>
+            <wp:cNvGraphicFramePr>
+              <a:graphicFrameLocks noChangeAspect="1"/>
+            </wp:cNvGraphicFramePr>
+            <a:graphic>
+              <a:graphicData uri="http://schemas.openxmlformats.org/drawingml/2006/picture">
+                <pic:pic>
+                  <pic:nvPicPr>
+                    <pic:cNvPr id="0" name="bestandskeuze_voorcontrole.png"/>
+                    <pic:cNvPicPr/>
+                  </pic:nvPicPr>
+                  <pic:blipFill>
+                    <a:blip r:embed="rId13"/>
+                    <a:stretch>
+                      <a:fillRect/>
+                    </a:stretch>
+                  </pic:blipFill>
+                  <pic:spPr>
+                    <a:xfrm>
+                      <a:off x="0" y="0"/>
+                      <a:ext cx="5943600" cy="4442841"/>
+                    </a:xfrm>
+                    <a:prstGeom prst="rect"/>
+                  </pic:spPr>
+                </pic:pic>
+              </a:graphicData>
+            </a:graphic>
+          </wp:inline>
+        </w:drawing>
+      </w:r>
+    </w:p>
     <w:p>
       <w:pPr>
         <w:pStyle w:val="Caption"/>
@@ -1130,60 +1100,45 @@
         <w:t>Figuur: Bestandskeuze en voorcontrole</w:t>
       </w:r>
     </w:p>
-    <w:tbl>
-      <w:tblPr>
-        <w:tblW w:type="auto" w:w="0"/>
-        <w:tblLayout w:type="fixed"/>
-        <w:tblLook w:firstColumn="1" w:firstRow="1" w:lastColumn="0" w:lastRow="0" w:noHBand="0" w:noVBand="1" w:val="04A0"/>
-      </w:tblPr>
-      <w:tblGrid>
-        <w:gridCol w:w="9864"/>
-      </w:tblGrid>
-      <w:tr>
-        <w:tc>
-          <w:tcPr>
-            <w:tcW w:type="dxa" w:w="9864"/>
-            <w:vAlign w:val="center"/>
-            <w:shd w:fill="F7F8FA"/>
-            <w:tcBorders>
-              <w:top w:val="single" w:sz="12" w:color="EA590C"/>
-              <w:left w:val="single" w:sz="12" w:color="EA590C"/>
-              <w:bottom w:val="single" w:sz="12" w:color="EA590C"/>
-              <w:right w:val="single" w:sz="12" w:color="EA590C"/>
-              <w:insideH w:val="single" w:sz="12" w:color="EA590C"/>
-              <w:insideV w:val="single" w:sz="12" w:color="EA590C"/>
-            </w:tcBorders>
-          </w:tcPr>
-          <w:p>
-            <w:pPr>
-              <w:spacing w:before="580" w:after="100"/>
-              <w:jc w:val="center"/>
-            </w:pPr>
-            <w:r>
-              <w:rPr>
-                <w:b/>
-                <w:color w:val="EA590C"/>
-                <w:sz w:val="26"/>
-              </w:rPr>
-              <w:t>[SCREENSHOT FILTERGROEPEN EN LIJSTEN HIER INVOEGEN]</w:t>
-            </w:r>
-          </w:p>
-          <w:p>
-            <w:pPr>
-              <w:spacing w:after="580"/>
-              <w:jc w:val="center"/>
-            </w:pPr>
-            <w:r>
-              <w:rPr>
-                <w:color w:val="637083"/>
-                <w:sz w:val="18"/>
-              </w:rPr>
-              <w:t>Voeg hier een screenshot toe van de filtergroepcheckboxes en geselecteerde lijstsoorten; scherm persoonlijke bestandspaden af.</w:t>
-            </w:r>
-          </w:p>
-        </w:tc>
-      </w:tr>
-    </w:tbl>
+    <w:p>
+      <w:pPr>
+        <w:jc w:val="center"/>
+      </w:pPr>
+      <w:r>
+        <w:drawing>
+          <wp:inline xmlns:a="http://schemas.openxmlformats.org/drawingml/2006/main" xmlns:pic="http://schemas.openxmlformats.org/drawingml/2006/picture">
+            <wp:extent cx="5943600" cy="2202847"/>
+            <wp:docPr id="4" name="Picture 4"/>
+            <wp:cNvGraphicFramePr>
+              <a:graphicFrameLocks noChangeAspect="1"/>
+            </wp:cNvGraphicFramePr>
+            <a:graphic>
+              <a:graphicData uri="http://schemas.openxmlformats.org/drawingml/2006/picture">
+                <pic:pic>
+                  <pic:nvPicPr>
+                    <pic:cNvPr id="0" name="filtergroepen_lijsten.png"/>
+                    <pic:cNvPicPr/>
+                  </pic:nvPicPr>
+                  <pic:blipFill>
+                    <a:blip r:embed="rId14"/>
+                    <a:stretch>
+                      <a:fillRect/>
+                    </a:stretch>
+                  </pic:blipFill>
+                  <pic:spPr>
+                    <a:xfrm>
+                      <a:off x="0" y="0"/>
+                      <a:ext cx="5943600" cy="2202847"/>
+                    </a:xfrm>
+                    <a:prstGeom prst="rect"/>
+                  </pic:spPr>
+                </pic:pic>
+              </a:graphicData>
+            </a:graphic>
+          </wp:inline>
+        </w:drawing>
+      </w:r>
+    </w:p>
     <w:p>
       <w:pPr>
         <w:pStyle w:val="Caption"/>
@@ -1270,60 +1225,45 @@
         <w:t>Tijdens de run toont de statusregel de actuele fase, zoals tekst verwerken of uitvoer opslaan. De voortgangsbalk is gebaseerd op de invoerbytes. Na voldoende meettijd verschijnt een schatting van de resterende tijd; dit blijft een benadering, omdat tekstinhoud de herkenningstijd beïnvloedt.</w:t>
       </w:r>
     </w:p>
-    <w:tbl>
-      <w:tblPr>
-        <w:tblW w:type="auto" w:w="0"/>
-        <w:tblLayout w:type="fixed"/>
-        <w:tblLook w:firstColumn="1" w:firstRow="1" w:lastColumn="0" w:lastRow="0" w:noHBand="0" w:noVBand="1" w:val="04A0"/>
-      </w:tblPr>
-      <w:tblGrid>
-        <w:gridCol w:w="9864"/>
-      </w:tblGrid>
-      <w:tr>
-        <w:tc>
-          <w:tcPr>
-            <w:tcW w:type="dxa" w:w="9864"/>
-            <w:vAlign w:val="center"/>
-            <w:shd w:fill="F7F8FA"/>
-            <w:tcBorders>
-              <w:top w:val="single" w:sz="12" w:color="EA590C"/>
-              <w:left w:val="single" w:sz="12" w:color="EA590C"/>
-              <w:bottom w:val="single" w:sz="12" w:color="EA590C"/>
-              <w:right w:val="single" w:sz="12" w:color="EA590C"/>
-              <w:insideH w:val="single" w:sz="12" w:color="EA590C"/>
-              <w:insideV w:val="single" w:sz="12" w:color="EA590C"/>
-            </w:tcBorders>
-          </w:tcPr>
-          <w:p>
-            <w:pPr>
-              <w:spacing w:before="580" w:after="100"/>
-              <w:jc w:val="center"/>
-            </w:pPr>
-            <w:r>
-              <w:rPr>
-                <w:b/>
-                <w:color w:val="EA590C"/>
-                <w:sz w:val="26"/>
-              </w:rPr>
-              <w:t>[SCREENSHOT VOORTGANG TIJDENS VERWERKING HIER INVOEGEN]</w:t>
-            </w:r>
-          </w:p>
-          <w:p>
-            <w:pPr>
-              <w:spacing w:after="580"/>
-              <w:jc w:val="center"/>
-            </w:pPr>
-            <w:r>
-              <w:rPr>
-                <w:color w:val="637083"/>
-                <w:sz w:val="18"/>
-              </w:rPr>
-              <w:t>Voeg hier een screenshot toe van een actieve run met fase, percentage en resttijd. Gebruik een niet-gevoelig voorbeeld.</w:t>
-            </w:r>
-          </w:p>
-        </w:tc>
-      </w:tr>
-    </w:tbl>
+    <w:p>
+      <w:pPr>
+        <w:jc w:val="center"/>
+      </w:pPr>
+      <w:r>
+        <w:drawing>
+          <wp:inline xmlns:a="http://schemas.openxmlformats.org/drawingml/2006/main" xmlns:pic="http://schemas.openxmlformats.org/drawingml/2006/picture">
+            <wp:extent cx="5943600" cy="4442841"/>
+            <wp:docPr id="5" name="Picture 5"/>
+            <wp:cNvGraphicFramePr>
+              <a:graphicFrameLocks noChangeAspect="1"/>
+            </wp:cNvGraphicFramePr>
+            <a:graphic>
+              <a:graphicData uri="http://schemas.openxmlformats.org/drawingml/2006/picture">
+                <pic:pic>
+                  <pic:nvPicPr>
+                    <pic:cNvPr id="0" name="voortgang.png"/>
+                    <pic:cNvPicPr/>
+                  </pic:nvPicPr>
+                  <pic:blipFill>
+                    <a:blip r:embed="rId15"/>
+                    <a:stretch>
+                      <a:fillRect/>
+                    </a:stretch>
+                  </pic:blipFill>
+                  <pic:spPr>
+                    <a:xfrm>
+                      <a:off x="0" y="0"/>
+                      <a:ext cx="5943600" cy="4442841"/>
+                    </a:xfrm>
+                    <a:prstGeom prst="rect"/>
+                  </pic:spPr>
+                </pic:pic>
+              </a:graphicData>
+            </a:graphic>
+          </wp:inline>
+        </w:drawing>
+      </w:r>
+    </w:p>
     <w:p>
       <w:pPr>
         <w:pStyle w:val="Caption"/>
@@ -1450,60 +1390,45 @@
         <w:t>Na succes verschijnt automatisch een scrollbaar venster met de volledige logresultaten, waaronder per filtergroep of die aan of uit stond. Onderin open je met Open resultaat het bestand, met Open uitvoermap de map en met Open log het logbestand. Sluit het met Sluiten, Escape of het kruisje. Daarna blijven dezelfde acties beschikbaar als kleine links (Resultaat · Uitvoermap · Log) rechts op de statusregel, tot je een nieuwe run start.</w:t>
       </w:r>
     </w:p>
-    <w:tbl>
-      <w:tblPr>
-        <w:tblW w:type="auto" w:w="0"/>
-        <w:tblLayout w:type="fixed"/>
-        <w:tblLook w:firstColumn="1" w:firstRow="1" w:lastColumn="0" w:lastRow="0" w:noHBand="0" w:noVBand="1" w:val="04A0"/>
-      </w:tblPr>
-      <w:tblGrid>
-        <w:gridCol w:w="9864"/>
-      </w:tblGrid>
-      <w:tr>
-        <w:tc>
-          <w:tcPr>
-            <w:tcW w:type="dxa" w:w="9864"/>
-            <w:vAlign w:val="center"/>
-            <w:shd w:fill="F7F8FA"/>
-            <w:tcBorders>
-              <w:top w:val="single" w:sz="12" w:color="EA590C"/>
-              <w:left w:val="single" w:sz="12" w:color="EA590C"/>
-              <w:bottom w:val="single" w:sz="12" w:color="EA590C"/>
-              <w:right w:val="single" w:sz="12" w:color="EA590C"/>
-              <w:insideH w:val="single" w:sz="12" w:color="EA590C"/>
-              <w:insideV w:val="single" w:sz="12" w:color="EA590C"/>
-            </w:tcBorders>
-          </w:tcPr>
-          <w:p>
-            <w:pPr>
-              <w:spacing w:before="580" w:after="100"/>
-              <w:jc w:val="center"/>
-            </w:pPr>
-            <w:r>
-              <w:rPr>
-                <w:b/>
-                <w:color w:val="EA590C"/>
-                <w:sz w:val="26"/>
-              </w:rPr>
-              <w:t>[SCREENSHOT RESULTATENVENSTER EN LOG HIER INVOEGEN]</w:t>
-            </w:r>
-          </w:p>
-          <w:p>
-            <w:pPr>
-              <w:spacing w:after="580"/>
-              <w:jc w:val="center"/>
-            </w:pPr>
-            <w:r>
-              <w:rPr>
-                <w:color w:val="637083"/>
-                <w:sz w:val="18"/>
-              </w:rPr>
-              <w:t>Voeg hier een screenshot toe van het resultatenvenster met synthetische metadata en tellingen. Verwijder eventuele gebruikersnamen of gevoelige paden.</w:t>
-            </w:r>
-          </w:p>
-        </w:tc>
-      </w:tr>
-    </w:tbl>
+    <w:p>
+      <w:pPr>
+        <w:jc w:val="center"/>
+      </w:pPr>
+      <w:r>
+        <w:drawing>
+          <wp:inline xmlns:a="http://schemas.openxmlformats.org/drawingml/2006/main" xmlns:pic="http://schemas.openxmlformats.org/drawingml/2006/picture">
+            <wp:extent cx="5943600" cy="4442841"/>
+            <wp:docPr id="6" name="Picture 6"/>
+            <wp:cNvGraphicFramePr>
+              <a:graphicFrameLocks noChangeAspect="1"/>
+            </wp:cNvGraphicFramePr>
+            <a:graphic>
+              <a:graphicData uri="http://schemas.openxmlformats.org/drawingml/2006/picture">
+                <pic:pic>
+                  <pic:nvPicPr>
+                    <pic:cNvPr id="0" name="resultatenvenster_log.png"/>
+                    <pic:cNvPicPr/>
+                  </pic:nvPicPr>
+                  <pic:blipFill>
+                    <a:blip r:embed="rId16"/>
+                    <a:stretch>
+                      <a:fillRect/>
+                    </a:stretch>
+                  </pic:blipFill>
+                  <pic:spPr>
+                    <a:xfrm>
+                      <a:off x="0" y="0"/>
+                      <a:ext cx="5943600" cy="4442841"/>
+                    </a:xfrm>
+                    <a:prstGeom prst="rect"/>
+                  </pic:spPr>
+                </pic:pic>
+              </a:graphicData>
+            </a:graphic>
+          </wp:inline>
+        </w:drawing>
+      </w:r>
+    </w:p>
     <w:p>
       <w:pPr>
         <w:pStyle w:val="Caption"/>

</xml_diff>

<commit_message>
Reword the instruction line; refresh manual screenshots
- GUI: "Tekstanonimisering: kies een invoerbestand en een uitvoermap.
  Stel daarna eventueel de extra opties in."
- Retake all five manual screenshots of the current GUI (synthetic data,
  window only) and regenerate Gebruiksaanwijzing_HealthNoord.docx

Co-Authored-By: Claude Opus 5.5 <noreply@anthropic.com>
</commit_message>
<xml_diff>
--- a/Gebruiksaanwijzing_HealthNoord.docx
+++ b/Gebruiksaanwijzing_HealthNoord.docx
@@ -698,7 +698,7 @@
       <w:r>
         <w:drawing>
           <wp:inline xmlns:a="http://schemas.openxmlformats.org/drawingml/2006/main" xmlns:pic="http://schemas.openxmlformats.org/drawingml/2006/picture">
-            <wp:extent cx="5943600" cy="4442841"/>
+            <wp:extent cx="5943600" cy="4383405"/>
             <wp:docPr id="2" name="Picture 2"/>
             <wp:cNvGraphicFramePr>
               <a:graphicFrameLocks noChangeAspect="1"/>
@@ -719,7 +719,7 @@
                   <pic:spPr>
                     <a:xfrm>
                       <a:off x="0" y="0"/>
-                      <a:ext cx="5943600" cy="4442841"/>
+                      <a:ext cx="5943600" cy="4383405"/>
                     </a:xfrm>
                     <a:prstGeom prst="rect"/>
                   </pic:spPr>
@@ -1055,7 +1055,7 @@
       <w:r>
         <w:drawing>
           <wp:inline xmlns:a="http://schemas.openxmlformats.org/drawingml/2006/main" xmlns:pic="http://schemas.openxmlformats.org/drawingml/2006/picture">
-            <wp:extent cx="5943600" cy="4442841"/>
+            <wp:extent cx="5943600" cy="4383405"/>
             <wp:docPr id="3" name="Picture 3"/>
             <wp:cNvGraphicFramePr>
               <a:graphicFrameLocks noChangeAspect="1"/>
@@ -1076,7 +1076,7 @@
                   <pic:spPr>
                     <a:xfrm>
                       <a:off x="0" y="0"/>
-                      <a:ext cx="5943600" cy="4442841"/>
+                      <a:ext cx="5943600" cy="4383405"/>
                     </a:xfrm>
                     <a:prstGeom prst="rect"/>
                   </pic:spPr>
@@ -1107,7 +1107,7 @@
       <w:r>
         <w:drawing>
           <wp:inline xmlns:a="http://schemas.openxmlformats.org/drawingml/2006/main" xmlns:pic="http://schemas.openxmlformats.org/drawingml/2006/picture">
-            <wp:extent cx="5943600" cy="2202847"/>
+            <wp:extent cx="5943600" cy="2206562"/>
             <wp:docPr id="4" name="Picture 4"/>
             <wp:cNvGraphicFramePr>
               <a:graphicFrameLocks noChangeAspect="1"/>
@@ -1128,7 +1128,7 @@
                   <pic:spPr>
                     <a:xfrm>
                       <a:off x="0" y="0"/>
-                      <a:ext cx="5943600" cy="2202847"/>
+                      <a:ext cx="5943600" cy="2206562"/>
                     </a:xfrm>
                     <a:prstGeom prst="rect"/>
                   </pic:spPr>
@@ -1232,7 +1232,7 @@
       <w:r>
         <w:drawing>
           <wp:inline xmlns:a="http://schemas.openxmlformats.org/drawingml/2006/main" xmlns:pic="http://schemas.openxmlformats.org/drawingml/2006/picture">
-            <wp:extent cx="5943600" cy="4442841"/>
+            <wp:extent cx="5943600" cy="4383405"/>
             <wp:docPr id="5" name="Picture 5"/>
             <wp:cNvGraphicFramePr>
               <a:graphicFrameLocks noChangeAspect="1"/>
@@ -1253,7 +1253,7 @@
                   <pic:spPr>
                     <a:xfrm>
                       <a:off x="0" y="0"/>
-                      <a:ext cx="5943600" cy="4442841"/>
+                      <a:ext cx="5943600" cy="4383405"/>
                     </a:xfrm>
                     <a:prstGeom prst="rect"/>
                   </pic:spPr>
@@ -1397,7 +1397,7 @@
       <w:r>
         <w:drawing>
           <wp:inline xmlns:a="http://schemas.openxmlformats.org/drawingml/2006/main" xmlns:pic="http://schemas.openxmlformats.org/drawingml/2006/picture">
-            <wp:extent cx="5943600" cy="4442841"/>
+            <wp:extent cx="5943600" cy="4383405"/>
             <wp:docPr id="6" name="Picture 6"/>
             <wp:cNvGraphicFramePr>
               <a:graphicFrameLocks noChangeAspect="1"/>
@@ -1418,7 +1418,7 @@
                   <pic:spPr>
                     <a:xfrm>
                       <a:off x="0" y="0"/>
-                      <a:ext cx="5943600" cy="4442841"/>
+                      <a:ext cx="5943600" cy="4383405"/>
                     </a:xfrm>
                     <a:prstGeom prst="rect"/>
                   </pic:spPr>

</xml_diff>

<commit_message>
Let extra lists take precedence over the whitelist
A term that is in the patient, staff or location list (full name, first
or last name part, or location) is now always anonymized, even when the
same term is on the whitelist. Longer whitelist phrases stay protected.
Document the rule in both manuals and regenerate the Word manual.

Co-Authored-By: Claude Opus 5.5 <noreply@anthropic.com>
</commit_message>
<xml_diff>
--- a/Gebruiksaanwijzing_HealthNoord.docx
+++ b/Gebruiksaanwijzing_HealthNoord.docx
@@ -1773,7 +1773,7 @@
     </w:p>
     <w:p>
       <w:r>
-        <w:t>Een whitelistbestand bevat één woord of woordgroep per regel. Overeenkomsten zijn hoofdletterongevoelig en volgen woordgrenzen. Een gevonden term wordt vóór herkenning beschermd en daarna in de oorspronkelijke schrijfwijze teruggezet.</w:t>
+        <w:t>Een whitelistbestand bevat één woord of woordgroep per regel. Overeenkomsten zijn hoofdletterongevoelig en volgen woordgrenzen. Een gevonden term wordt vóór herkenning beschermd en daarna in de oorspronkelijke schrijfwijze teruggezet. Staat een term ook in de patiënten-, medewerkers- of locatielijst, dan gaat die lijst voor en wordt de term toch geanonimiseerd.</w:t>
       </w:r>
     </w:p>
     <w:tbl>
@@ -2191,7 +2191,7 @@
               <w:rPr>
                 <w:sz w:val="18"/>
               </w:rPr>
-              <w:t>Controleer de exacte woordgroep, spelling en woordgrenzen in het whitelistbestand. Gebruik geen te brede korte termen.</w:t>
+              <w:t>Controleer de exacte woordgroep, spelling en woordgrenzen in het whitelistbestand. Gebruik geen te brede korte termen. Staat de term ook in een extra lijst, dan wordt hij bewust toch geanonimiseerd.</w:t>
             </w:r>
           </w:p>
         </w:tc>

</xml_diff>

<commit_message>
Apply the name lists more strictly
- Keep a double surname with a spaced hyphen ("van den Broek - Zoon")
  together, so "Zoon" alone is no longer a search term
- A lone first or last name, or a one-word name (tussenvoegsels not
  counted, e.g. "Arts", "de Goede"), only matches when a non-tussenvoegsel
  word is capitalized in the text; multi-word full names still match in
  any case
- Document the rules in both manuals and regenerate the Word manual

Co-Authored-By: Claude Opus 5.5 <noreply@anthropic.com>
</commit_message>
<xml_diff>
--- a/Gebruiksaanwijzing_HealthNoord.docx
+++ b/Gebruiksaanwijzing_HealthNoord.docx
@@ -1764,6 +1764,11 @@
       </w:r>
     </w:p>
     <w:p>
+      <w:r>
+        <w:t>Hoofdletters, spaties, regelafbrekingen, koppeltekens en apostroffen mogen afwijken van de lijst. Een dubbele achternaam zoals 'van den Broek - Zoon' blijft één geheel. Een losse voor- of achternaam, of een naam van één woord (eventueel met tussenvoegsel), wordt alleen vervangen als die in de tekst met een hoofdletter staat: 'Arts' en 'de Goede' wel, de gewone woorden 'arts' en 'de goede' niet. Volledige namen van meer woorden worden altijd vervangen. Aan het begin van een zin kan een naam die ook een gewoon woord is (zoals 'Bij') nog worden vervangen.</w:t>
+      </w:r>
+    </w:p>
+    <w:p>
       <w:pPr>
         <w:pStyle w:val="Heading2"/>
       </w:pPr>

</xml_diff>

<commit_message>
Skip everyday words at a sentence start; let the whitelist keep them
- A one-word name that is also an everyday Dutch word (Deduce's own
  whitelist of common words, stop words and medical terms, plus a short
  list of inflected forms such as "linker" and "nieuwe") is not replaced
  at the start of a sentence, line or field. After a title or initial
  ("mevr. Anders") and mid-sentence it still is
- Such everyday one-word terms can now be kept by whitelisting them; other
  listed names still take precedence over the whitelist
- Document both rules and regenerate the Word manual

Co-Authored-By: Claude Opus 5.5 <noreply@anthropic.com>
</commit_message>
<xml_diff>
--- a/Gebruiksaanwijzing_HealthNoord.docx
+++ b/Gebruiksaanwijzing_HealthNoord.docx
@@ -1765,7 +1765,7 @@
     </w:p>
     <w:p>
       <w:r>
-        <w:t>Hoofdletters, spaties, regelafbrekingen, koppeltekens en apostroffen mogen afwijken van de lijst. Een dubbele achternaam zoals 'van den Broek - Zoon' blijft één geheel. Een losse voor- of achternaam, of een naam van één woord (eventueel met tussenvoegsel), wordt alleen vervangen als die in de tekst met een hoofdletter staat: 'Arts' en 'de Goede' wel, de gewone woorden 'arts' en 'de goede' niet. Volledige namen van meer woorden worden altijd vervangen. Aan het begin van een zin kan een naam die ook een gewoon woord is (zoals 'Bij') nog worden vervangen.</w:t>
+        <w:t>Hoofdletters, spaties, regelafbrekingen, koppeltekens en apostroffen mogen afwijken van de lijst. Een dubbele achternaam zoals 'van den Broek - Zoon' blijft één geheel. Een losse voor- of achternaam, of een naam van één woord (eventueel met tussenvoegsel), wordt alleen vervangen als die in de tekst met een hoofdletter staat: 'Arts' en 'de Goede' wel, de gewone woorden 'arts' en 'de goede' niet. Volledige namen van meer woorden worden altijd vervangen. Een naam van één woord die ook een gewoon Nederlands woord is (zoals 'Linker' of 'Anders') wordt aan het begin van een zin niet vervangen, omdat de hoofdletter daar van het zinsbegin komt; na een titel of voorletter ('mevr. Anders') en midden in een zin wel.</w:t>
       </w:r>
     </w:p>
     <w:p>
@@ -1778,7 +1778,7 @@
     </w:p>
     <w:p>
       <w:r>
-        <w:t>Een whitelistbestand bevat één woord of woordgroep per regel. Overeenkomsten zijn hoofdletterongevoelig en volgen woordgrenzen. Een gevonden term wordt vóór herkenning beschermd en daarna in de oorspronkelijke schrijfwijze teruggezet. Staat een term ook in de patiënten-, medewerkers- of locatielijst, dan gaat die lijst voor en wordt de term toch geanonimiseerd.</w:t>
+        <w:t>Een whitelistbestand bevat één woord of woordgroep per regel. Overeenkomsten zijn hoofdletterongevoelig en volgen woordgrenzen. Een gevonden term wordt vóór herkenning beschermd en daarna in de oorspronkelijke schrijfwijze teruggezet. Staat een term ook in de patiënten-, medewerkers- of locatielijst, dan gaat die lijst voor en wordt de term toch geanonimiseerd. Uitzondering: een term van één woord die ook een gewoon Nederlands woord is (zoals 'Kamer' of 'Zondag') blijft staan als die op de whitelist staat.</w:t>
       </w:r>
     </w:p>
     <w:tbl>
@@ -2196,7 +2196,35 @@
               <w:rPr>
                 <w:sz w:val="18"/>
               </w:rPr>
-              <w:t>Controleer de exacte woordgroep, spelling en woordgrenzen in het whitelistbestand. Gebruik geen te brede korte termen. Staat de term ook in een extra lijst, dan wordt hij bewust toch geanonimiseerd.</w:t>
+              <w:t>Controleer de exacte woordgroep, spelling en woordgrenzen in het whitelistbestand. Gebruik geen te brede korte termen. Staat de term ook in een extra lijst, dan wordt hij bewust toch geanonimiseerd, behalve als het één gewoon Nederlands woord is.</w:t>
+            </w:r>
+          </w:p>
+        </w:tc>
+      </w:tr>
+      <w:tr>
+        <w:tc>
+          <w:tcPr>
+            <w:tcW w:type="dxa" w:w="4997"/>
+          </w:tcPr>
+          <w:p>
+            <w:r>
+              <w:rPr>
+                <w:sz w:val="18"/>
+              </w:rPr>
+              <w:t>Gewoon woord wordt als naam vervangen</w:t>
+            </w:r>
+          </w:p>
+        </w:tc>
+        <w:tc>
+          <w:tcPr>
+            <w:tcW w:type="dxa" w:w="4997"/>
+          </w:tcPr>
+          <w:p>
+            <w:r>
+              <w:rPr>
+                <w:sz w:val="18"/>
+              </w:rPr>
+              <w:t>Het woord staat in de namenlijst en midden in een zin met hoofdletter. Zet het op de whitelist of haal het uit de namenlijst.</w:t>
             </w:r>
           </w:p>
         </w:tc>

</xml_diff>

<commit_message>
Apply the extra lists before Deduce; replace shared names too
Names from the extra lists leaked because Deduce ran first and split them
("Ter [PERSOON-1]", "[PERSOON-1]-Meer"), after which the list no longer
recognized the leftovers. On a synthetic set of 200 names in 600 notes,
42 lines leaked a name or name part; now 1.

- Run the extra lists on the original text before Deduce and hide their
  pseudonyms from Deduce, so a listed name is replaced whole
- A first or last name shared by several listed people is replaced with
  its own pseudonym instead of being left standing
- First names from a full name are replaced at a sentence start as well;
  the sentence-start rule now only covers surnames and one-word entries
- Add more everyday words (klein, boven, ...); set the manual date
- Update both manuals and regenerate the Word manual

Co-Authored-By: Claude Opus 5.5 <noreply@anthropic.com>
</commit_message>
<xml_diff>
--- a/Gebruiksaanwijzing_HealthNoord.docx
+++ b/Gebruiksaanwijzing_HealthNoord.docx
@@ -137,7 +137,7 @@
           <w:color w:val="637083"/>
           <w:sz w:val="18"/>
         </w:rPr>
-        <w:t>Versie van deze handleiding: 14 oktober 2026</w:t>
+        <w:t>Versie van deze handleiding: 15 oktober 2026</w:t>
       </w:r>
     </w:p>
     <w:p>
@@ -531,7 +531,7 @@
               <w:rPr>
                 <w:sz w:val="18"/>
               </w:rPr>
-              <w:t>Patiëntnamen als aanvullende vangnetherkenning</w:t>
+              <w:t>Patiëntnamen die zeker vervangen moeten worden</w:t>
             </w:r>
           </w:p>
         </w:tc>
@@ -572,7 +572,7 @@
               <w:rPr>
                 <w:sz w:val="18"/>
               </w:rPr>
-              <w:t>Medewerkersnamen als aanvullende vangnetherkenning</w:t>
+              <w:t>Medewerkersnamen die zeker vervangen moeten worden</w:t>
             </w:r>
           </w:p>
         </w:tc>
@@ -1760,12 +1760,12 @@
     </w:p>
     <w:p>
       <w:r>
-        <w:t>Extra lijsten zijn aanvullende vangnetten voor termen die Deduce mogelijk niet herkent. Namenlijsten kunnen volledige namen en bruikbare schrijfvarianten bevatten; locatielijsten bevatten één locatie per regel. De tool kan personen pseudonimiseren met consistente placeholders en telt extra vervangingen afzonderlijk in het log.</w:t>
+        <w:t>Extra lijsten bevatten namen en locaties die zeker vervangen moeten worden. Ze worden vóór Deduce toegepast, zodat een naam uit de lijst in zijn geheel wordt vervangen, inclusief tussenvoegsels en dubbele achternaam; daarna anonimiseert Deduce de rest van de tekst. Namenlijsten bevatten volledige namen (voornaam en achternaam); locatielijsten bevatten één locatie per regel. Een voor- of achternaam die meerdere mensen in de lijst delen, wordt ook los vervangen, met een eigen pseudoniem. De tool kan personen pseudonimiseren met consistente placeholders en telt extra vervangingen afzonderlijk in het log.</w:t>
       </w:r>
     </w:p>
     <w:p>
       <w:r>
-        <w:t>Hoofdletters, spaties, regelafbrekingen, koppeltekens en apostroffen mogen afwijken van de lijst. Een dubbele achternaam zoals 'van den Broek - Zoon' blijft één geheel. Een losse voor- of achternaam, of een naam van één woord (eventueel met tussenvoegsel), wordt alleen vervangen als die in de tekst met een hoofdletter staat: 'Arts' en 'de Goede' wel, de gewone woorden 'arts' en 'de goede' niet. Volledige namen van meer woorden worden altijd vervangen. Een naam van één woord die ook een gewoon Nederlands woord is (zoals 'Linker' of 'Anders') wordt aan het begin van een zin niet vervangen, omdat de hoofdletter daar van het zinsbegin komt; na een titel of voorletter ('mevr. Anders') en midden in een zin wel.</w:t>
+        <w:t>Hoofdletters, spaties, regelafbrekingen, koppeltekens en apostroffen mogen afwijken van de lijst. Een dubbele achternaam zoals 'van den Broek - Zoon' blijft één geheel. Een losse voor- of achternaam, of een naam van één woord (eventueel met tussenvoegsel), wordt alleen vervangen als die in de tekst met een hoofdletter staat: 'Arts' en 'de Goede' wel, de gewone woorden 'arts' en 'de goede' niet. Volledige namen van meer woorden worden altijd vervangen. Een achternaam of naam van één woord die ook een gewoon Nederlands woord is (zoals 'Linker' of 'Anders') wordt aan het begin van een zin niet vervangen, omdat de hoofdletter daar van het zinsbegin komt; na een titel of voorletter ('mevr. Anders') en midden in een zin wel. Voornamen uit een volledige naam (zoals 'Wil' uit 'Wil Bakker') worden ook aan het begin van een zin vervangen.</w:t>
       </w:r>
     </w:p>
     <w:p>

</xml_diff>

<commit_message>
Match all lists in one pass; keep house numbers; catch MG postcodes
- Match the name and location lists in one pass where the longest match
  wins, so the street "Harmen Systrasingel" beats the first name "Harmen"
- A street from the location list takes its house number along ("12a",
  "12 A", "258-K"), which Deduce no longer sees once the street is gone
- Treat four digits plus a capital "MG" as a postcode (Deduce skips it as
  milligrams); a lowercase "1000 mg" stays a dose
- Manual: correct what the tool remembers (only filter choices), document
  the new rules, set the date and regenerate the Word manual

Co-Authored-By: Claude Opus 5.5 <noreply@anthropic.com>
</commit_message>
<xml_diff>
--- a/Gebruiksaanwijzing_HealthNoord.docx
+++ b/Gebruiksaanwijzing_HealthNoord.docx
@@ -137,7 +137,7 @@
           <w:color w:val="637083"/>
           <w:sz w:val="18"/>
         </w:rPr>
-        <w:t>Versie van deze handleiding: 15 oktober 2026</w:t>
+        <w:t>Versie van deze handleiding: 16 oktober 2026</w:t>
       </w:r>
     </w:p>
     <w:p>
@@ -1760,7 +1760,7 @@
     </w:p>
     <w:p>
       <w:r>
-        <w:t>Extra lijsten bevatten namen en locaties die zeker vervangen moeten worden. Ze worden vóór Deduce toegepast, zodat een naam uit de lijst in zijn geheel wordt vervangen, inclusief tussenvoegsels en dubbele achternaam; daarna anonimiseert Deduce de rest van de tekst. Namenlijsten bevatten volledige namen (voornaam en achternaam); locatielijsten bevatten één locatie per regel. Een voor- of achternaam die meerdere mensen in de lijst delen, wordt ook los vervangen, met een eigen pseudoniem. De tool kan personen pseudonimiseren met consistente placeholders en telt extra vervangingen afzonderlijk in het log.</w:t>
+        <w:t>Extra lijsten bevatten namen en locaties die zeker vervangen moeten worden. Ze worden vóór Deduce toegepast, zodat een naam uit de lijst in zijn geheel wordt vervangen, inclusief tussenvoegsels en dubbele achternaam; daarna anonimiseert Deduce de rest van de tekst. Namenlijsten bevatten volledige namen (voornaam en achternaam); locatielijsten bevatten één locatie per regel. Een voor- of achternaam die meerdere mensen in de lijst delen, wordt ook los vervangen, met een eigen pseudoniem. Alle lijsten worden in één keer doorlopen en de langste treffer wint, zodat de straat 'Harmen Systrasingel' uit de locatielijst voorgaat op de voornaam 'Harmen'. Bij een straat uit de locatielijst wordt het huisnummer meegenomen, ook met toevoeging ('12a', '258-K'). Een locatie wordt alleen als hele regel herkend; zet varianten daarom als aparte regels in de lijst. Een postcode op 'MG' in hoofdletters ('9257MG'), die Deduce overslaat, wordt als locatie vervangen; '1000 mg' in kleine letters blijft staan als dosering. De tool kan personen pseudonimiseren met consistente placeholders en telt extra vervangingen afzonderlijk in het log.</w:t>
       </w:r>
     </w:p>
     <w:p>
@@ -1843,7 +1843,7 @@
     </w:p>
     <w:p>
       <w:r>
-        <w:t>De tool bewaart de filterkeuzes en het pad naar het whitelistbestand lokaal in het Windows-profiel van de gebruiker onder `%LOCALAPPDATA%\HealthNoord\AnonymisatieTool`. De inhoud van de whitelist wordt niet in de instellingen gekopieerd. Het hoofd-invoerbestand wordt bewust nooit onthouden; selecteer dit voor iedere run opnieuw.</w:t>
+        <w:t>De tool bewaart de filterkeuzes. De andere keuzes worden bewust nooit onthouden; selecteer dit voor iedere run opnieuw.</w:t>
       </w:r>
     </w:p>
     <w:p>

</xml_diff>

<commit_message>
Rename the synthetic data to epd_synthetisch; document it in the manual
- testdata/synthetisch/care_data_synthetisch.txt -> epd_synthetisch.txt;
  the generator and evaluation scripts use the new name
- New manual chapter "9. Oefenen en testen met synthetische data" (files,
  how to practise with them, the evaluation script); later chapters
  renumbered; same section in the EXE guide; Word manual regenerated

Co-Authored-By: Claude Opus 5.5 <noreply@anthropic.com>
</commit_message>
<xml_diff>
--- a/Gebruiksaanwijzing_HealthNoord.docx
+++ b/Gebruiksaanwijzing_HealthNoord.docx
@@ -222,7 +222,7 @@
         <w:pStyle w:val="ListBullet"/>
       </w:pPr>
       <w:r>
-        <w:t>9. Privacy en veilig gebruik</w:t>
+        <w:t>9. Oefenen en testen met synthetische data</w:t>
       </w:r>
     </w:p>
     <w:p>
@@ -230,7 +230,7 @@
         <w:pStyle w:val="ListBullet"/>
       </w:pPr>
       <w:r>
-        <w:t>10. Problemen oplossen</w:t>
+        <w:t>10. Privacy en veilig gebruik</w:t>
       </w:r>
     </w:p>
     <w:p>
@@ -238,7 +238,15 @@
         <w:pStyle w:val="ListBullet"/>
       </w:pPr>
       <w:r>
-        <w:t>11. Controlelijst voor vrijgave</w:t>
+        <w:t>11. Problemen oplossen</w:t>
+      </w:r>
+    </w:p>
+    <w:p>
+      <w:pPr>
+        <w:pStyle w:val="ListBullet"/>
+      </w:pPr>
+      <w:r>
+        <w:t>12. Controlelijst voor vrijgave</w:t>
       </w:r>
     </w:p>
     <w:p>
@@ -1851,7 +1859,329 @@
         <w:pStyle w:val="Heading1"/>
       </w:pPr>
       <w:r>
-        <w:t>9. Privacy en veilig gebruik</w:t>
+        <w:t>9. Oefenen en testen met synthetische data</w:t>
+      </w:r>
+    </w:p>
+    <w:p>
+      <w:r>
+        <w:t>Bij de tool hoort een synthetische testset: een nagemaakte EPD-export met zorgnotities waarin alle personen, adressen, telefoonnummers, e-mailadressen, BSN's en datums verzonnen zijn. Het bestand heeft hetzelfde formaat als een echte export (tabgescheiden met de kolommen objectId en comment, meerregelige notities en ongeveer de helft lege notities). Je kunt er veilig mee oefenen, een demonstratie geven of controleren hoe goed de tool werkt, zonder echte gegevens te gebruiken.</w:t>
+      </w:r>
+    </w:p>
+    <w:tbl>
+      <w:tblPr>
+        <w:tblStyle w:val="TableGrid"/>
+        <w:tblW w:type="auto" w:w="0"/>
+        <w:tblLayout w:type="autofit"/>
+        <w:tblLook w:firstColumn="1" w:firstRow="1" w:lastColumn="0" w:lastRow="0" w:noHBand="0" w:noVBand="1" w:val="04A0"/>
+      </w:tblPr>
+      <w:tblGrid>
+        <w:gridCol w:w="4997"/>
+        <w:gridCol w:w="4997"/>
+      </w:tblGrid>
+      <w:tr>
+        <w:trPr>
+          <w:tblHeader w:val="true"/>
+        </w:trPr>
+        <w:tc>
+          <w:tcPr>
+            <w:tcW w:type="dxa" w:w="4997"/>
+            <w:shd w:fill="1F2D54"/>
+          </w:tcPr>
+          <w:p>
+            <w:r>
+              <w:rPr>
+                <w:b/>
+                <w:color w:val="FFFFFF"/>
+                <w:sz w:val="18"/>
+              </w:rPr>
+              <w:t>Bestand (map testdata\synthetisch)</w:t>
+            </w:r>
+          </w:p>
+        </w:tc>
+        <w:tc>
+          <w:tcPr>
+            <w:tcW w:type="dxa" w:w="4997"/>
+            <w:shd w:fill="1F2D54"/>
+          </w:tcPr>
+          <w:p>
+            <w:r>
+              <w:rPr>
+                <w:b/>
+                <w:color w:val="FFFFFF"/>
+                <w:sz w:val="18"/>
+              </w:rPr>
+              <w:t>Inhoud</w:t>
+            </w:r>
+          </w:p>
+        </w:tc>
+      </w:tr>
+      <w:tr>
+        <w:tc>
+          <w:tcPr>
+            <w:tcW w:type="dxa" w:w="4997"/>
+          </w:tcPr>
+          <w:p>
+            <w:r>
+              <w:rPr>
+                <w:sz w:val="18"/>
+              </w:rPr>
+              <w:t>epd_synthetisch.txt</w:t>
+            </w:r>
+          </w:p>
+        </w:tc>
+        <w:tc>
+          <w:tcPr>
+            <w:tcW w:type="dxa" w:w="4997"/>
+          </w:tcPr>
+          <w:p>
+            <w:r>
+              <w:rPr>
+                <w:sz w:val="18"/>
+              </w:rPr>
+              <w:t>Invoerbestand met 1000 records, waarvan ongeveer 550 met een zorgnotitie.</w:t>
+            </w:r>
+          </w:p>
+        </w:tc>
+      </w:tr>
+      <w:tr>
+        <w:tc>
+          <w:tcPr>
+            <w:tcW w:type="dxa" w:w="4997"/>
+          </w:tcPr>
+          <w:p>
+            <w:r>
+              <w:rPr>
+                <w:sz w:val="18"/>
+              </w:rPr>
+              <w:t>patienten.txt</w:t>
+            </w:r>
+          </w:p>
+        </w:tc>
+        <w:tc>
+          <w:tcPr>
+            <w:tcW w:type="dxa" w:w="4997"/>
+          </w:tcPr>
+          <w:p>
+            <w:r>
+              <w:rPr>
+                <w:sz w:val="18"/>
+              </w:rPr>
+              <w:t>150 verzonnen patiëntnamen, voor de patiëntenlijst.</w:t>
+            </w:r>
+          </w:p>
+        </w:tc>
+      </w:tr>
+      <w:tr>
+        <w:tc>
+          <w:tcPr>
+            <w:tcW w:type="dxa" w:w="4997"/>
+          </w:tcPr>
+          <w:p>
+            <w:r>
+              <w:rPr>
+                <w:sz w:val="18"/>
+              </w:rPr>
+              <w:t>medewerkers.txt</w:t>
+            </w:r>
+          </w:p>
+        </w:tc>
+        <w:tc>
+          <w:tcPr>
+            <w:tcW w:type="dxa" w:w="4997"/>
+          </w:tcPr>
+          <w:p>
+            <w:r>
+              <w:rPr>
+                <w:sz w:val="18"/>
+              </w:rPr>
+              <w:t>40 verzonnen medewerkersnamen, voor de medewerkerslijst.</w:t>
+            </w:r>
+          </w:p>
+        </w:tc>
+      </w:tr>
+      <w:tr>
+        <w:tc>
+          <w:tcPr>
+            <w:tcW w:type="dxa" w:w="4997"/>
+          </w:tcPr>
+          <w:p>
+            <w:r>
+              <w:rPr>
+                <w:sz w:val="18"/>
+              </w:rPr>
+              <w:t>locaties.txt</w:t>
+            </w:r>
+          </w:p>
+        </w:tc>
+        <w:tc>
+          <w:tcPr>
+            <w:tcW w:type="dxa" w:w="4997"/>
+          </w:tcPr>
+          <w:p>
+            <w:r>
+              <w:rPr>
+                <w:sz w:val="18"/>
+              </w:rPr>
+              <w:t>Straatnamen, voor de locatielijst.</w:t>
+            </w:r>
+          </w:p>
+        </w:tc>
+      </w:tr>
+      <w:tr>
+        <w:tc>
+          <w:tcPr>
+            <w:tcW w:type="dxa" w:w="4997"/>
+          </w:tcPr>
+          <w:p>
+            <w:r>
+              <w:rPr>
+                <w:sz w:val="18"/>
+              </w:rPr>
+              <w:t>whitelist.txt</w:t>
+            </w:r>
+          </w:p>
+        </w:tc>
+        <w:tc>
+          <w:tcPr>
+            <w:tcW w:type="dxa" w:w="4997"/>
+          </w:tcPr>
+          <w:p>
+            <w:r>
+              <w:rPr>
+                <w:sz w:val="18"/>
+              </w:rPr>
+              <w:t>Enkele medische termen die moeten blijven staan.</w:t>
+            </w:r>
+          </w:p>
+        </w:tc>
+      </w:tr>
+      <w:tr>
+        <w:tc>
+          <w:tcPr>
+            <w:tcW w:type="dxa" w:w="4997"/>
+          </w:tcPr>
+          <w:p>
+            <w:r>
+              <w:rPr>
+                <w:sz w:val="18"/>
+              </w:rPr>
+              <w:t>sleutel.json</w:t>
+            </w:r>
+          </w:p>
+        </w:tc>
+        <w:tc>
+          <w:tcPr>
+            <w:tcW w:type="dxa" w:w="4997"/>
+          </w:tcPr>
+          <w:p>
+            <w:r>
+              <w:rPr>
+                <w:sz w:val="18"/>
+              </w:rPr>
+              <w:t>Antwoordsleutel: per notitie welke gegevens gevoelig zijn en welke gewone woorden moeten blijven staan.</w:t>
+            </w:r>
+          </w:p>
+        </w:tc>
+      </w:tr>
+    </w:tbl>
+    <w:p>
+      <w:pPr>
+        <w:pStyle w:val="Heading2"/>
+      </w:pPr>
+      <w:r>
+        <w:t>Oefenen met de testset</w:t>
+      </w:r>
+    </w:p>
+    <w:p>
+      <w:pPr>
+        <w:pStyle w:val="ListNumber"/>
+      </w:pPr>
+      <w:r>
+        <w:t>Kies bij Invoer .txt het bestand epd_synthetisch.txt en kies een uitvoermap.</w:t>
+      </w:r>
+    </w:p>
+    <w:p>
+      <w:pPr>
+        <w:pStyle w:val="ListNumber"/>
+      </w:pPr>
+      <w:r>
+        <w:t>Kies eventueel patienten.txt, medewerkers.txt, locaties.txt en whitelist.txt bij de optionele bestanden.</w:t>
+      </w:r>
+    </w:p>
+    <w:p>
+      <w:pPr>
+        <w:pStyle w:val="ListNumber"/>
+      </w:pPr>
+      <w:r>
+        <w:t>Klik op Anonimiseer bestand en bekijk het resultaat en het logbestand.</w:t>
+      </w:r>
+    </w:p>
+    <w:p>
+      <w:pPr>
+        <w:pStyle w:val="ListNumber"/>
+      </w:pPr>
+      <w:r>
+        <w:t>Draai de testset ook eens zonder lijsten en vergelijk het resultaat: zo zie je wat de extra lijsten toevoegen.</w:t>
+      </w:r>
+    </w:p>
+    <w:p>
+      <w:r>
+        <w:t>In de notities zitten bewust lastige gevallen: namen met en zonder titel, voorletters, tussenvoegsels en dubbele achternamen, familieleden die niet in de lijsten staan, adressen met huisnummer en postcode, datums met en zonder jaartal, en gewone woorden die op een naam lijken (zoals 'Linker been' of 'Meer pijn'). Die gewone woorden horen na anonimisering te blijven staan.</w:t>
+      </w:r>
+    </w:p>
+    <w:tbl>
+      <w:tblPr>
+        <w:tblW w:type="auto" w:w="0"/>
+        <w:tblLayout w:type="autofit"/>
+        <w:tblLook w:firstColumn="1" w:firstRow="1" w:lastColumn="0" w:lastRow="0" w:noHBand="0" w:noVBand="1" w:val="04A0"/>
+      </w:tblPr>
+      <w:tblGrid>
+        <w:gridCol w:w="9994"/>
+      </w:tblGrid>
+      <w:tr>
+        <w:tc>
+          <w:tcPr>
+            <w:tcW w:type="dxa" w:w="9994"/>
+            <w:vAlign w:val="center"/>
+            <w:shd w:fill="EEF2F8"/>
+            <w:tcBorders>
+              <w:top w:val="single" w:sz="8" w:color="C9D1DC"/>
+              <w:left w:val="single" w:sz="8" w:color="C9D1DC"/>
+              <w:bottom w:val="single" w:sz="8" w:color="C9D1DC"/>
+              <w:right w:val="single" w:sz="8" w:color="C9D1DC"/>
+              <w:insideH w:val="single" w:sz="8" w:color="C9D1DC"/>
+              <w:insideV w:val="single" w:sz="8" w:color="C9D1DC"/>
+            </w:tcBorders>
+          </w:tcPr>
+          <w:p>
+            <w:pPr>
+              <w:spacing w:after="40"/>
+            </w:pPr>
+            <w:r>
+              <w:rPr>
+                <w:b/>
+                <w:color w:val="1F2D54"/>
+              </w:rPr>
+              <w:t xml:space="preserve">Voor technisch beheer  </w:t>
+            </w:r>
+            <w:r>
+              <w:t>Het script scripts\evaluate_testset.py draait de tool op de testset en telt met de antwoordsleutel per soort gegeven hoeveel er nog in de uitvoer staat. Met scripts\make_synthetic_testset.py maak je een nieuwe testset; met de optie --seed een andere variant. Gebruik de testset na elke wijziging van de tool om te controleren dat de anonimisering niet slechter is geworden.</w:t>
+            </w:r>
+          </w:p>
+        </w:tc>
+      </w:tr>
+    </w:tbl>
+    <w:p>
+      <w:pPr>
+        <w:spacing w:after="0"/>
+      </w:pPr>
+    </w:p>
+    <w:p>
+      <w:pPr>
+        <w:pStyle w:val="Heading1"/>
+      </w:pPr>
+      <w:r>
+        <w:t>10. Privacy en veilig gebruik</w:t>
       </w:r>
     </w:p>
     <w:p>
@@ -1954,7 +2284,7 @@
         <w:pStyle w:val="Heading1"/>
       </w:pPr>
       <w:r>
-        <w:t>10. Problemen oplossen</w:t>
+        <w:t>11. Problemen oplossen</w:t>
       </w:r>
     </w:p>
     <w:tbl>
@@ -2263,7 +2593,7 @@
         <w:pStyle w:val="Heading1"/>
       </w:pPr>
       <w:r>
-        <w:t>11. Controlelijst voor vrijgave</w:t>
+        <w:t>12. Controlelijst voor vrijgave</w:t>
       </w:r>
     </w:p>
     <w:p>

</xml_diff>